<commit_message>
docs: guia do RH com endpoint e cabeçalho reais do servidor de comunicados
Co-Authored-By: Claude Sonnet 5.5 <noreply@anthropic.com>
Claude-Session: https://claude.ai/code/session_0137pXBEVZNfjwQtuRHnzeLS
</commit_message>
<xml_diff>
--- a/AHBT-IT-TI-XXX-00_Guia-Integracao-Aniversariantes-RH_2026-10-01.docx
+++ b/AHBT-IT-TI-XXX-00_Guia-Integracao-Aniversariantes-RH_2026-10-01.docx
@@ -1135,7 +1135,7 @@
                 <w:i w:val="0"/>
                 <w:sz w:val="18"/>
               </w:rPr>
-              <w:t>Domínio identificado (ver 7.1); caminho exato a confirmar</w:t>
+              <w:t>POST /agendar-comunicado (ver 7.5)</w:t>
             </w:r>
           </w:p>
         </w:tc>
@@ -1218,7 +1218,7 @@
                 <w:i w:val="0"/>
                 <w:sz w:val="18"/>
               </w:rPr>
-              <w:t>A criar pela TI</w:t>
+              <w:t>Variável API_KEY_RH criada; entregar ao RH</w:t>
             </w:r>
           </w:p>
         </w:tc>
@@ -1247,7 +1247,7 @@
                 <w:i w:val="0"/>
                 <w:sz w:val="18"/>
               </w:rPr>
-              <w:t>Formato e cabeçalho de autenticação</w:t>
+              <w:t>Cabeçalho de autenticação</w:t>
             </w:r>
           </w:p>
         </w:tc>
@@ -1274,7 +1274,7 @@
                 <w:i w:val="0"/>
                 <w:sz w:val="18"/>
               </w:rPr>
-              <w:t>Montar a chamada corretamente</w:t>
+              <w:t>Identificar o RH em cada chamada</w:t>
             </w:r>
           </w:p>
         </w:tc>
@@ -1301,7 +1301,7 @@
                 <w:i w:val="0"/>
                 <w:sz w:val="18"/>
               </w:rPr>
-              <w:t>A confirmar no código do servidor</w:t>
+              <w:t>Cabeçalho x-api-key (ver 7.5)</w:t>
             </w:r>
           </w:p>
         </w:tc>
@@ -2030,7 +2030,7 @@
           <w:i w:val="0"/>
           <w:sz w:val="20"/>
         </w:rPr>
-        <w:t>A ferramenta utilizada é o agendamento de comunicado. Os campos obrigatórios e os principais campos opcionais estão descritos na Tabela 4. O exemplo completo consta no Anexo A.</w:t>
+        <w:t>A chamada é feita por POST em /agendar-comunicado, no endereço do servidor, com o cabeçalho x-api-key contendo a chave do RH e o corpo em JSON (Content-Type: application/json). O servidor responde com o resultado do agendamento. A ferramenta utilizada é o agendamento de comunicado. Os campos obrigatórios e os principais campos opcionais estão descritos na Tabela 4. O exemplo completo consta no Anexo A.</w:t>
       </w:r>
     </w:p>
     <w:p>
@@ -3680,7 +3680,7 @@
                 <w:i w:val="0"/>
                 <w:sz w:val="18"/>
               </w:rPr>
-              <w:t>Confirmar o caminho (endpoint), o formato de chamada e o cabeçalho de autenticação do servidor</w:t>
+              <w:t>Confirmar a publicação em produção da versão que reconhece a chave do RH (API_KEY_RH)</w:t>
             </w:r>
           </w:p>
         </w:tc>
@@ -3763,7 +3763,7 @@
                 <w:i w:val="0"/>
                 <w:sz w:val="18"/>
               </w:rPr>
-              <w:t>Definir o acesso externo: domínio próprio ou exceção controlada (7.2)</w:t>
+              <w:t>Definir o acesso externo: domínio próprio ou exceção controlada (7.2); confirmar o e-mail da identidade do RH (variável EMAIL_RH)</w:t>
             </w:r>
           </w:p>
         </w:tc>
@@ -3846,7 +3846,7 @@
                 <w:i w:val="0"/>
                 <w:sz w:val="18"/>
               </w:rPr>
-              <w:t>Criar a chave de API exclusiva do RH</w:t>
+              <w:t>Entregar a chave de API do RH por canal seguro</w:t>
             </w:r>
           </w:p>
         </w:tc>

</xml_diff>